<commit_message>
chore: update generated example DOCX files for reconciler fixes
</commit_message>
<xml_diff>
--- a/examples/generated/complete_all_features.docx
+++ b/examples/generated/complete_all_features.docx
@@ -367,7 +367,7 @@
           <wp:inline>
             <wp:extent wp:cx="5486400" wp:cy="3200400"/>
             <wp:effectExtent/>
-            <wp:docPr wp:id="868416964" wp:name="Chart 593497"/>
+            <wp:docPr wp:id="672006100" wp:name="Chart 513638"/>
             <graphic xmlns="http://schemas.openxmlformats.org/drawingml/2006/main">
               <graphicData uri="http://schemas.openxmlformats.org/drawingml/2006/chart">
                 <chart xmlns="http://schemas.openxmlformats.org/drawingml/2006/chart" c:id="rIdChart1"/>
@@ -391,7 +391,7 @@
           <wp:inline>
             <wp:extent wp:cx="5486400" wp:cy="3200400"/>
             <wp:effectExtent/>
-            <wp:docPr wp:id="910170834" wp:name="Chart 830319"/>
+            <wp:docPr wp:id="255518824" wp:name="Chart 577842"/>
             <graphic xmlns="http://schemas.openxmlformats.org/drawingml/2006/main">
               <graphicData uri="http://schemas.openxmlformats.org/drawingml/2006/chart">
                 <chart xmlns="http://schemas.openxmlformats.org/drawingml/2006/chart" c:id="rIdChart2"/>

</xml_diff>

<commit_message>
revert: remove prop_value/yaml_val helpers — UninitializedClass is a lutaml-model bug
Reverted non-model-driven workarounds (prop_value, yaml_val) that
violated the project's model-driven architecture principle.

The UninitializedClass NoMethodError is a lutaml-model upstream bug
(documented in TODO.lutaml-model-bugs.md) — their method_missing
should not raise for safe navigation.

Also updated TODO.lutaml-model-bugs.md to list all affected files
and clarify no workaround should be applied.

Updated generated DOCX examples for reconciler/map_content changes.
</commit_message>
<xml_diff>
--- a/examples/generated/complete_all_features.docx
+++ b/examples/generated/complete_all_features.docx
@@ -367,7 +367,7 @@
           <wp:inline>
             <wp:extent wp:cx="5486400" wp:cy="3200400"/>
             <wp:effectExtent/>
-            <wp:docPr wp:id="672006100" wp:name="Chart 513638"/>
+            <wp:docPr wp:id="716482952" wp:name="Chart 535550"/>
             <graphic xmlns="http://schemas.openxmlformats.org/drawingml/2006/main">
               <graphicData uri="http://schemas.openxmlformats.org/drawingml/2006/chart">
                 <chart xmlns="http://schemas.openxmlformats.org/drawingml/2006/chart" c:id="rIdChart1"/>
@@ -391,7 +391,7 @@
           <wp:inline>
             <wp:extent wp:cx="5486400" wp:cy="3200400"/>
             <wp:effectExtent/>
-            <wp:docPr wp:id="255518824" wp:name="Chart 577842"/>
+            <wp:docPr wp:id="994852977" wp:name="Chart 572759"/>
             <graphic xmlns="http://schemas.openxmlformats.org/drawingml/2006/main">
               <graphicData uri="http://schemas.openxmlformats.org/drawingml/2006/chart">
                 <chart xmlns="http://schemas.openxmlformats.org/drawingml/2006/chart" c:id="rIdChart2"/>

</xml_diff>

<commit_message>
chore: update generated example DOCX files
</commit_message>
<xml_diff>
--- a/examples/generated/complete_all_features.docx
+++ b/examples/generated/complete_all_features.docx
@@ -367,7 +367,7 @@
           <wp:inline>
             <wp:extent wp:cx="5486400" wp:cy="3200400"/>
             <wp:effectExtent/>
-            <wp:docPr wp:id="716482952" wp:name="Chart 535550"/>
+            <wp:docPr wp:id="552144980" wp:name="Chart 797159"/>
             <graphic xmlns="http://schemas.openxmlformats.org/drawingml/2006/main">
               <graphicData uri="http://schemas.openxmlformats.org/drawingml/2006/chart">
                 <chart xmlns="http://schemas.openxmlformats.org/drawingml/2006/chart" c:id="rIdChart1"/>
@@ -391,7 +391,7 @@
           <wp:inline>
             <wp:extent wp:cx="5486400" wp:cy="3200400"/>
             <wp:effectExtent/>
-            <wp:docPr wp:id="994852977" wp:name="Chart 572759"/>
+            <wp:docPr wp:id="93173099" wp:name="Chart 473680"/>
             <graphic xmlns="http://schemas.openxmlformats.org/drawingml/2006/main">
               <graphicData uri="http://schemas.openxmlformats.org/drawingml/2006/chart">
                 <chart xmlns="http://schemas.openxmlformats.org/drawingml/2006/chart" c:id="rIdChart2"/>

</xml_diff>

<commit_message>
chore: update .gitignore and generated example DOCX files
</commit_message>
<xml_diff>
--- a/examples/generated/complete_all_features.docx
+++ b/examples/generated/complete_all_features.docx
@@ -367,7 +367,7 @@
           <wp:inline>
             <wp:extent wp:cx="5486400" wp:cy="3200400"/>
             <wp:effectExtent/>
-            <wp:docPr wp:id="552144980" wp:name="Chart 797159"/>
+            <wp:docPr wp:id="289066107" wp:name="Chart 335638"/>
             <graphic xmlns="http://schemas.openxmlformats.org/drawingml/2006/main">
               <graphicData uri="http://schemas.openxmlformats.org/drawingml/2006/chart">
                 <chart xmlns="http://schemas.openxmlformats.org/drawingml/2006/chart" c:id="rIdChart1"/>
@@ -391,7 +391,7 @@
           <wp:inline>
             <wp:extent wp:cx="5486400" wp:cy="3200400"/>
             <wp:effectExtent/>
-            <wp:docPr wp:id="93173099" wp:name="Chart 473680"/>
+            <wp:docPr wp:id="980737034" wp:name="Chart 923010"/>
             <graphic xmlns="http://schemas.openxmlformats.org/drawingml/2006/main">
               <graphicData uri="http://schemas.openxmlformats.org/drawingml/2006/chart">
                 <chart xmlns="http://schemas.openxmlformats.org/drawingml/2006/chart" c:id="rIdChart2"/>

</xml_diff>